<commit_message>
Audit references and update proof corrections
</commit_message>
<xml_diff>
--- a/anti_ageing_review_MJDRDYPU/proof_review/MJDRDYPU_451_26_author_proof_corrections_2026-08-09.docx
+++ b/anti_ageing_review_MJDRDYPU/proof_review/MJDRDYPU_451_26_author_proof_corrections_2026-08-09.docx
@@ -4,137 +4,203 @@
   <w:body>
     <w:p>
       <w:pPr>
-        <w:spacing w:after="80"/>
         <w:jc w:val="center"/>
       </w:pPr>
       <w:r>
         <w:rPr>
-          <w:rFonts w:ascii="Arial" w:hAnsi="Arial"/>
           <w:b/>
-          <w:color w:val="1F4E79"/>
-          <w:sz w:val="34"/>
+          <w:sz w:val="28"/>
         </w:rPr>
-        <w:t>Author proof response - concise version</w:t>
+        <w:t>Author proof response — concise version</w:t>
       </w:r>
     </w:p>
     <w:p>
       <w:pPr>
-        <w:spacing w:after="240"/>
         <w:jc w:val="center"/>
       </w:pPr>
       <w:r>
         <w:rPr>
-          <w:rFonts w:ascii="Arial" w:hAnsi="Arial"/>
-          <w:color w:val="595959"/>
           <w:sz w:val="19"/>
         </w:rPr>
-        <w:t>Medical Journal of Dr. D.Y. Patil Vidyapeeth  |  Manuscript mjdrdypu_451_26</w:t>
+        <w:t>Medical Journal of Dr. D.Y. Patil Vidyapeeth | Manuscript mjdrdypu_451_26</w:t>
       </w:r>
     </w:p>
     <w:p>
       <w:pPr>
-        <w:spacing w:after="180"/>
+        <w:spacing w:after="80"/>
       </w:pPr>
       <w:r>
-        <w:t>Thank you for the author proof. Our responses are as follows.</w:t>
+        <w:rPr>
+          <w:b w:val="0"/>
+        </w:rPr>
+        <w:t>Thank you for the author proof. Our responses and requested corrections are below.</w:t>
       </w:r>
     </w:p>
     <w:p>
       <w:pPr>
-        <w:spacing w:after="140" w:line="252" w:lineRule="auto"/>
+        <w:spacing w:after="80"/>
       </w:pPr>
       <w:r>
         <w:rPr>
           <w:b/>
-          <w:color w:val="1F4E79"/>
         </w:rPr>
-        <w:t xml:space="preserve">AQ1 - Article type and format. </w:t>
-      </w:r>
-      <w:r>
-        <w:t>Please retain the current Systematic Review/Evidence Map classification. If journal policy permits a structured secondary evidence synthesis of this type to be classified as an Original Article, we would welcome that classification; otherwise, no change is needed.</w:t>
+        <w:t xml:space="preserve">AQ1 — Article type and format. </w:t>
       </w:r>
     </w:p>
     <w:p>
       <w:pPr>
-        <w:spacing w:after="140" w:line="252" w:lineRule="auto"/>
+        <w:spacing w:after="80"/>
+      </w:pPr>
+      <w:r>
+        <w:rPr>
+          <w:b w:val="0"/>
+        </w:rPr>
+        <w:t>Please retain the current Systematic Review/Evidence Map classification. If journal policy permits this structured secondary evidence synthesis to be classified as an Original Article, we would welcome that classification; otherwise, no change is needed.</w:t>
+      </w:r>
+    </w:p>
+    <w:p>
+      <w:pPr>
+        <w:spacing w:after="80"/>
       </w:pPr>
       <w:r>
         <w:rPr>
           <w:b/>
-          <w:color w:val="1F4E79"/>
         </w:rPr>
-        <w:t xml:space="preserve">AQ2 - Supplementary material. </w:t>
-      </w:r>
-      <w:r>
-        <w:t>Yes, supplementary material is required. Please retain it as a separate file; it contains supporting Figures S1-S4 and Tables S1-S9.</w:t>
+        <w:t xml:space="preserve">AQ2 — Supplementary material. </w:t>
       </w:r>
     </w:p>
     <w:p>
       <w:pPr>
-        <w:spacing w:after="140" w:line="252" w:lineRule="auto"/>
+        <w:spacing w:after="80"/>
+      </w:pPr>
+      <w:r>
+        <w:rPr>
+          <w:b w:val="0"/>
+        </w:rPr>
+        <w:t>Yes, supplementary material is required. Please retain it as a separate file; it contains supporting Figures S1–S4 and Tables S1–S9.</w:t>
+      </w:r>
+    </w:p>
+    <w:p>
+      <w:pPr>
+        <w:spacing w:after="80"/>
       </w:pPr>
       <w:r>
         <w:rPr>
           <w:b/>
-          <w:color w:val="1F4E79"/>
+        </w:rPr>
+        <w:t xml:space="preserve">Reference corrections — references 1–14 and spelling checked. </w:t>
+      </w:r>
+    </w:p>
+    <w:p>
+      <w:pPr>
+        <w:spacing w:after="80"/>
+      </w:pPr>
+      <w:r>
+        <w:rPr>
+          <w:b w:val="0"/>
+        </w:rPr>
+        <w:t>References 1–8, 10, and 14 were verified with no substantive spelling or bibliographic error identified. Please make these corrections:</w:t>
+      </w:r>
+    </w:p>
+    <w:p>
+      <w:pPr>
+        <w:pStyle w:val="ListBullet"/>
+        <w:spacing w:after="40"/>
+      </w:pPr>
+      <w:r>
+        <w:t>Reference 9: change the page range from 840–863 to 908–936. The author-proof PDF already shows the correct range in abbreviated form (908–36).</w:t>
+      </w:r>
+    </w:p>
+    <w:p>
+      <w:pPr>
+        <w:pStyle w:val="ListBullet"/>
+        <w:spacing w:after="40"/>
+      </w:pPr>
+      <w:r>
+        <w:t>Reference 11: use 2016;5(2):1–9. The submitted DOCX omits the volume/issue/pages, and the proof currently shows an incorrect page range (126–34).</w:t>
+      </w:r>
+    </w:p>
+    <w:p>
+      <w:pPr>
+        <w:pStyle w:val="ListBullet"/>
+        <w:spacing w:after="40"/>
+      </w:pPr>
+      <w:r>
+        <w:t>Reference 13: retain/add the issue and article number as 2026;25(2):e70376. The submitted DOCX contains this detail; the proof omits the issue.</w:t>
+      </w:r>
+    </w:p>
+    <w:p>
+      <w:pPr>
+        <w:pStyle w:val="ListBullet"/>
+        <w:spacing w:after="40"/>
+      </w:pPr>
+      <w:r>
+        <w:t>Reference 12: use the full published title, “Caloric restriction and time-restricted eating in older adults with overweight or obesity: The Health, Aging, and Later-Life Outcomes Pilot Study,” if the journal permits title-level correction.</w:t>
+      </w:r>
+    </w:p>
+    <w:p>
+      <w:pPr>
+        <w:spacing w:after="80"/>
+      </w:pPr>
+      <w:r>
+        <w:rPr>
+          <w:b/>
         </w:rPr>
         <w:t xml:space="preserve">Repository address. </w:t>
       </w:r>
+    </w:p>
+    <w:p>
+      <w:pPr>
+        <w:spacing w:after="80"/>
+      </w:pPr>
       <w:r>
+        <w:rPr>
+          <w:b w:val="0"/>
+        </w:rPr>
         <w:t>Please keep the existing repository-root address in the article; no link correction is requested.</w:t>
       </w:r>
     </w:p>
     <w:p>
       <w:pPr>
-        <w:spacing w:after="140" w:line="252" w:lineRule="auto"/>
+        <w:spacing w:after="80"/>
       </w:pPr>
       <w:r>
         <w:rPr>
           <w:b/>
-          <w:color w:val="1F4E79"/>
         </w:rPr>
         <w:t xml:space="preserve">Editorial confirmation. </w:t>
-      </w:r>
-      <w:r>
-        <w:t>No other substantive correction is requested. Production details, pagination, volume/issue information, and routine copyediting may be completed by the editorial team. The term "controversial" may be retained where used in the accepted manuscript to reflect the current evidence framing.</w:t>
       </w:r>
     </w:p>
     <w:p>
       <w:pPr>
-        <w:spacing w:before="120"/>
+        <w:spacing w:after="80"/>
       </w:pPr>
       <w:r>
+        <w:rPr>
+          <w:b w:val="0"/>
+        </w:rPr>
+        <w:t>No other substantive correction is requested. Production details, pagination, volume/issue information, and routine copyediting may be completed by the editorial team. The term “controversial” may be retained where used in the accepted manuscript to reflect the current evidence framing.</w:t>
+      </w:r>
+    </w:p>
+    <w:p>
+      <w:pPr>
+        <w:spacing w:after="80"/>
+      </w:pPr>
+      <w:r>
+        <w:rPr>
+          <w:b w:val="0"/>
+        </w:rPr>
         <w:t>Thank you.</w:t>
       </w:r>
     </w:p>
     <w:sectPr>
-      <w:footerReference w:type="default" r:id="rId9"/>
       <w:pgSz w:w="12240" w:h="15840"/>
-      <w:pgMar w:top="1080" w:right="1296" w:bottom="1008" w:left="1296" w:header="720" w:footer="720" w:gutter="0"/>
+      <w:pgMar w:top="1008" w:right="1152" w:bottom="1008" w:left="1152" w:header="720" w:footer="720" w:gutter="0"/>
       <w:cols w:space="720"/>
       <w:docGrid w:linePitch="360"/>
     </w:sectPr>
   </w:body>
 </w:document>
-</file>
-
-<file path=word/footer1.xml><?xml version="1.0" encoding="utf-8"?>
-<w:ftr xmlns:m="http://schemas.openxmlformats.org/officeDocument/2006/math" xmlns:mc="http://schemas.openxmlformats.org/markup-compatibility/2006" xmlns:mo="http://schemas.microsoft.com/office/mac/office/2008/main" xmlns:mv="urn:schemas-microsoft-com:mac:vml" xmlns:o="urn:schemas-microsoft-com:office:office" xmlns:r="http://schemas.openxmlformats.org/officeDocument/2006/relationships" xmlns:v="urn:schemas-microsoft-com:vml" xmlns:w10="urn:schemas-microsoft-com:office:word" xmlns:w14="http://schemas.microsoft.com/office/word/2010/wordml" xmlns:w="http://schemas.openxmlformats.org/wordprocessingml/2006/main" xmlns:wne="http://schemas.microsoft.com/office/word/2006/wordml" xmlns:wp14="http://schemas.microsoft.com/office/word/2010/wordprocessingDrawing" xmlns:wp="http://schemas.openxmlformats.org/drawingml/2006/wordprocessingDrawing" xmlns:wpc="http://schemas.microsoft.com/office/word/2010/wordprocessingCanvas" xmlns:wpg="http://schemas.microsoft.com/office/word/2010/wordprocessingGroup" xmlns:wpi="http://schemas.microsoft.com/office/word/2010/wordprocessingInk" xmlns:wps="http://schemas.microsoft.com/office/word/2010/wordprocessingShape" mc:Ignorable="w14 wp14">
-  <w:p>
-    <w:pPr>
-      <w:pStyle w:val="Footer"/>
-      <w:jc w:val="center"/>
-    </w:pPr>
-    <w:r>
-      <w:rPr>
-        <w:rFonts w:ascii="Arial" w:hAnsi="Arial"/>
-        <w:color w:val="595959"/>
-        <w:sz w:val="16"/>
-      </w:rPr>
-      <w:t>Prepared for author proof submission | 9 August 2026</w:t>
-    </w:r>
-  </w:p>
-</w:ftr>
 </file>
 
 <file path=word/numbering.xml><?xml version="1.0" encoding="utf-8"?>
@@ -501,8 +567,7 @@
     <w:qFormat/>
     <w:rsid w:val="00FC693F"/>
     <w:rPr>
-      <w:rFonts w:ascii="Arial" w:hAnsi="Arial" w:eastAsia="Arial"/>
-      <w:color w:val="202020"/>
+      <w:rFonts w:ascii="Arial" w:hAnsi="Arial"/>
       <w:sz w:val="21"/>
     </w:rPr>
   </w:style>
@@ -565,11 +630,11 @@
       <w:outlineLvl w:val="0"/>
     </w:pPr>
     <w:rPr>
-      <w:rFonts w:asciiTheme="majorHAnsi" w:eastAsiaTheme="majorEastAsia" w:hAnsiTheme="majorHAnsi" w:cstheme="majorBidi" w:ascii="Arial" w:hAnsi="Arial" w:eastAsia="Arial"/>
+      <w:rFonts w:asciiTheme="majorHAnsi" w:eastAsiaTheme="majorEastAsia" w:hAnsiTheme="majorHAnsi" w:cstheme="majorBidi"/>
       <w:b/>
       <w:bCs/>
-      <w:color w:val="1F4E79"/>
-      <w:sz w:val="24"/>
+      <w:color w:val="365F91" w:themeColor="accent1" w:themeShade="BF"/>
+      <w:sz w:val="28"/>
       <w:szCs w:val="28"/>
     </w:rPr>
   </w:style>
@@ -589,11 +654,11 @@
       <w:outlineLvl w:val="1"/>
     </w:pPr>
     <w:rPr>
-      <w:rFonts w:asciiTheme="majorHAnsi" w:eastAsiaTheme="majorEastAsia" w:hAnsiTheme="majorHAnsi" w:cstheme="majorBidi" w:ascii="Arial" w:hAnsi="Arial" w:eastAsia="Arial"/>
+      <w:rFonts w:asciiTheme="majorHAnsi" w:eastAsiaTheme="majorEastAsia" w:hAnsiTheme="majorHAnsi" w:cstheme="majorBidi"/>
       <w:b/>
       <w:bCs/>
-      <w:color w:val="1F4E79"/>
-      <w:sz w:val="22"/>
+      <w:color w:val="4F81BD" w:themeColor="accent1"/>
+      <w:sz w:val="26"/>
       <w:szCs w:val="26"/>
     </w:rPr>
   </w:style>

</xml_diff>

<commit_message>
Keep proof response limited to author queries
</commit_message>
<xml_diff>
--- a/anti_ageing_review_MJDRDYPU/proof_review/MJDRDYPU_451_26_author_proof_corrections_2026-08-09.docx
+++ b/anti_ageing_review_MJDRDYPU/proof_review/MJDRDYPU_451_26_author_proof_corrections_2026-08-09.docx
@@ -33,7 +33,7 @@
         <w:rPr>
           <w:b w:val="0"/>
         </w:rPr>
-        <w:t>Thank you for the author proof. Our responses and requested corrections are below.</w:t>
+        <w:t>Thank you for the author proof. Our responses are as follows.</w:t>
       </w:r>
     </w:p>
     <w:p>
@@ -88,7 +88,7 @@
         <w:rPr>
           <w:b/>
         </w:rPr>
-        <w:t xml:space="preserve">Reference corrections — references 1–14 and spelling checked. </w:t>
+        <w:t xml:space="preserve">Reference and spelling check. </w:t>
       </w:r>
     </w:p>
     <w:p>
@@ -99,43 +99,7 @@
         <w:rPr>
           <w:b w:val="0"/>
         </w:rPr>
-        <w:t>References 1–8, 10, and 14 were verified with no substantive spelling or bibliographic error identified. Please make these corrections:</w:t>
-      </w:r>
-    </w:p>
-    <w:p>
-      <w:pPr>
-        <w:pStyle w:val="ListBullet"/>
-        <w:spacing w:after="40"/>
-      </w:pPr>
-      <w:r>
-        <w:t>Reference 9: change the page range from 840–863 to 908–936. The author-proof PDF already shows the correct range in abbreviated form (908–36).</w:t>
-      </w:r>
-    </w:p>
-    <w:p>
-      <w:pPr>
-        <w:pStyle w:val="ListBullet"/>
-        <w:spacing w:after="40"/>
-      </w:pPr>
-      <w:r>
-        <w:t>Reference 11: use 2016;5(2):1–9. The submitted DOCX omits the volume/issue/pages, and the proof currently shows an incorrect page range (126–34).</w:t>
-      </w:r>
-    </w:p>
-    <w:p>
-      <w:pPr>
-        <w:pStyle w:val="ListBullet"/>
-        <w:spacing w:after="40"/>
-      </w:pPr>
-      <w:r>
-        <w:t>Reference 13: retain/add the issue and article number as 2026;25(2):e70376. The submitted DOCX contains this detail; the proof omits the issue.</w:t>
-      </w:r>
-    </w:p>
-    <w:p>
-      <w:pPr>
-        <w:pStyle w:val="ListBullet"/>
-        <w:spacing w:after="40"/>
-      </w:pPr>
-      <w:r>
-        <w:t>Reference 12: use the full published title, “Caloric restriction and time-restricted eating in older adults with overweight or obesity: The Health, Aging, and Later-Life Outcomes Pilot Study,” if the journal permits title-level correction.</w:t>
+        <w:t>References 1–14 were rechecked in the author-proof PDF and source records. No reference modification or substantive spelling correction is requested.</w:t>
       </w:r>
     </w:p>
     <w:p>

</xml_diff>